<commit_message>
Refina validacao e apresentacao do formulario
- Validacao unificada por campo, com faixa, casas decimais e mensagem propria.
- Letras e sinais sao bloqueados na digitacao; colagem invalida e recusada.
- Dicas de faixa e exemplo abaixo de cada campo, com valor inicial em virgula.
- Campos mais altos e com borda mais firme, para leitura ao sol.
- Testes de navegador ampliados para 44 verificacoes, em computador e celular.
- Documentacao reescrita para leitor nao programador, com comparacao original
  e atual e checklist de usabilidade.

Os calculos e os textos tecnicos do professor Nildo foram preservados.
</commit_message>
<xml_diff>
--- a/RECUPERA-SOLO - Teste de uso.docx
+++ b/RECUPERA-SOLO - Teste de uso.docx
@@ -250,6 +250,11 @@
       </w:r>
     </w:p>
     <w:p>
+      <w:r>
+        <w:t>Nos campos numéricos, letras não são aceitas. Vírgula e ponto valem como separador decimal, e a faixa aceita aparece abaixo de cada campo.</w:t>
+      </w:r>
+    </w:p>
+    <w:p>
       <w:pPr>
         <w:jc w:val="both"/>
         <w:rPr>
@@ -1995,6 +2000,68 @@
           <w:szCs w:val="18"/>
         </w:rPr>
         <w:t>Dúvida ou comentário: ______________________________________________________________</w:t>
+      </w:r>
+    </w:p>
+    <w:p/>
+    <w:p>
+      <w:r>
+        <w:t>TAREFA G - Usar sem internet</w:t>
+      </w:r>
+    </w:p>
+    <w:p>
+      <w:r>
+        <w:t>1. Instale o APK no aparelho e abra o aplicativo.</w:t>
+      </w:r>
+    </w:p>
+    <w:p>
+      <w:r>
+        <w:t>2. Ative o modo avião.</w:t>
+      </w:r>
+    </w:p>
+    <w:p>
+      <w:r>
+        <w:t>3. Repita o Caso 1 e gere o diagnóstico.</w:t>
+      </w:r>
+    </w:p>
+    <w:p>
+      <w:r>
+        <w:t>4. Compare o resultado com o obtido no navegador.</w:t>
+      </w:r>
+    </w:p>
+    <w:p>
+      <w:r>
+        <w:t>O resultado foi o mesmo?  ( ) Sim   ( ) Não   ( ) Não foi possível testar</w:t>
+      </w:r>
+    </w:p>
+    <w:p/>
+    <w:p>
+      <w:r>
+        <w:t>TAREFA H - Corrigir um valor inválido</w:t>
+      </w:r>
+    </w:p>
+    <w:p>
+      <w:r>
+        <w:t>1. No campo pH, tente digitar uma letra.</w:t>
+      </w:r>
+    </w:p>
+    <w:p>
+      <w:r>
+        <w:t>2. Verifique se o caractere entrou no campo.</w:t>
+      </w:r>
+    </w:p>
+    <w:p>
+      <w:r>
+        <w:t>3. Informe pH 15 e gere o diagnóstico.</w:t>
+      </w:r>
+    </w:p>
+    <w:p>
+      <w:r>
+        <w:t>4. Leia a mensagem apresentada e corrija o valor.</w:t>
+      </w:r>
+    </w:p>
+    <w:p>
+      <w:r>
+        <w:t>A mensagem indicou o campo e a faixa aceita?  ( ) Sim   ( ) Em parte   ( ) Não</w:t>
       </w:r>
     </w:p>
     <w:p>

</xml_diff>

<commit_message>
Roteiro de teste de uso ajustado à interface atual
- Tarefas reescritas em voz passiva e com os nomes dos controles atuais: gerar diagnóstico, usar exemplo, nova análise, compartilhar resumo e voltar ao início.
- Tarefa A com a quarta seção e a barra inferior; tarefa I nova, sobre a ajuda do cálculo.
- Tarefa F inclui a confirmação de limpeza, e a tarefa H descreve o aviso durante a digitação e o resumo de erros.
- Quadro de registro com as tarefas G, H e I e questionário com dois itens sobre a barra inferior e o retorno ao início.
- Apêndice D registra que textura, drenagem e qualidade da água não entram no cálculo.
</commit_message>
<xml_diff>
--- a/RECUPERA-SOLO - Teste de uso.docx
+++ b/RECUPERA-SOLO - Teste de uso.docx
@@ -165,17 +165,7 @@
           <w:sz w:val="16"/>
           <w:szCs w:val="18"/>
         </w:rPr>
-        <w:t>Protocolo adaptado dos Apêndices A a C de Medeiros (2018). Os casos de teste e a ficha de validação foram elaborados</w:t>
-      </w:r>
-      <w:r>
-        <w:rPr>
-          <w:rFonts w:ascii="Verdana" w:hAnsi="Verdana"/>
-          <w:i/>
-          <w:color w:val="555555"/>
-          <w:sz w:val="16"/>
-          <w:szCs w:val="18"/>
-        </w:rPr>
-        <w:t xml:space="preserve"> para o RECUPERA-SOLO. O protocolo deve ser ajustado às funções efetivamente disponíveis na versão testada.</w:t>
+        <w:t>Protocolo adaptado dos Apêndices A a C de Medeiros (2018). Os casos de teste e a ficha de validação foram elaborados para o RECUPERA-SOLO e ajustados à interface atual, com rótulos flutuantes, texto de apoio sob cada campo, barra inferior no celular, confirmação de limpeza, compartilhamento do resumo e retorno ao início. O protocolo deve ser ajustado às funções efetivamente disponíveis na versão testada.</w:t>
       </w:r>
     </w:p>
     <w:p>
@@ -251,7 +241,7 @@
     </w:p>
     <w:p>
       <w:r>
-        <w:t>Nos campos numéricos, letras não são aceitas. Vírgula e ponto valem como separador decimal, e a faixa aceita aparece abaixo de cada campo.</w:t>
+        <w:t>Nos campos numéricos, letras não são aceitas. Vírgula e ponto valem como separador decimal, a faixa aceita e o exemplo aparecem em texto de apoio sob cada campo, e o valor digitado fica em negrito. O aviso de valor fora da faixa surge durante a digitação.</w:t>
       </w:r>
     </w:p>
     <w:p>
@@ -269,7 +259,24 @@
           <w:sz w:val="18"/>
           <w:szCs w:val="18"/>
         </w:rPr>
-        <w:t>Instruções: execute as tarefas sem ajuda, sempre que possível. Diga em voz alta o que procura, o que espera encontrar e o que considera confuso. Os dados dos casos são fictícios e servem exclusivamente ao teste e não constituem prescrição agronômica.</w:t>
+        <w:t>Instruções: as tarefas são executadas sem ajuda, sempre que possível. O que se procura, o que se espera encontrar e o que parece confuso são ditos em voz alta. Os dados dos casos são fictícios, servem exclusivamente ao teste e não constituem prescrição agronômica.</w:t>
+      </w:r>
+    </w:p>
+    <w:p>
+      <w:pPr>
+        <w:rPr>
+          <w:rFonts w:ascii="Verdana" w:hAnsi="Verdana"/>
+          <w:sz w:val="18"/>
+          <w:szCs w:val="18"/>
+        </w:rPr>
+      </w:pPr>
+      <w:r>
+        <w:rPr>
+          <w:rFonts w:ascii="Verdana" w:hAnsi="Verdana"/>
+          <w:sz w:val="18"/>
+          <w:szCs w:val="18"/>
+        </w:rPr>
+        <w:t>A interface tem quatro seções numeradas: 1 Escolha como iniciar, 2 Dados de entrada, 3 Corretivos e custos e 4 Resultados integrados. No celular, a barra inferior mantém Gerar diagnóstico e o atalho Resultados ao alcance.</w:t>
       </w:r>
     </w:p>
     <w:p>
@@ -306,83 +313,75 @@
           <w:sz w:val="18"/>
           <w:szCs w:val="18"/>
         </w:rPr>
-        <w:t>1. Acesse a página inicial do RECUPERA-SOLO.</w:t>
-      </w:r>
-    </w:p>
-    <w:p>
-      <w:pPr>
-        <w:rPr>
-          <w:rFonts w:ascii="Verdana" w:hAnsi="Verdana"/>
-          <w:sz w:val="18"/>
-          <w:szCs w:val="18"/>
-        </w:rPr>
-      </w:pPr>
-      <w:r>
-        <w:rPr>
-          <w:rFonts w:ascii="Verdana" w:hAnsi="Verdana"/>
-          <w:sz w:val="18"/>
-          <w:szCs w:val="18"/>
-        </w:rPr>
-        <w:t>2. Localize a área de entrada de dados para diagnóstico e cálculo de recuperação de solos sódicos.</w:t>
-      </w:r>
-    </w:p>
-    <w:p>
-      <w:pPr>
-        <w:rPr>
-          <w:rFonts w:ascii="Verdana" w:hAnsi="Verdana"/>
-          <w:sz w:val="18"/>
-          <w:szCs w:val="18"/>
-        </w:rPr>
-      </w:pPr>
-      <w:r>
-        <w:rPr>
-          <w:rFonts w:ascii="Verdana" w:hAnsi="Verdana"/>
-          <w:sz w:val="18"/>
-          <w:szCs w:val="18"/>
-        </w:rPr>
-        <w:t xml:space="preserve">3. Identifique quais informações do solo são solicitadas e onde estão os exemplos de preenchimento de cada campo. </w:t>
-      </w:r>
-    </w:p>
-    <w:p>
-      <w:pPr>
-        <w:rPr>
-          <w:rFonts w:ascii="Verdana" w:hAnsi="Verdana"/>
-          <w:sz w:val="18"/>
-          <w:szCs w:val="18"/>
-        </w:rPr>
-      </w:pPr>
-      <w:r>
-        <w:rPr>
-          <w:rFonts w:ascii="Verdana" w:hAnsi="Verdana"/>
-          <w:sz w:val="18"/>
-          <w:szCs w:val="18"/>
-        </w:rPr>
-        <w:t>4. Responda: Em qual seção está o campo Drenagem?</w:t>
-      </w:r>
-    </w:p>
-    <w:p>
-      <w:pPr>
-        <w:rPr>
-          <w:rFonts w:ascii="Verdana" w:hAnsi="Verdana"/>
-          <w:sz w:val="18"/>
-          <w:szCs w:val="18"/>
-        </w:rPr>
-      </w:pPr>
-      <w:r>
-        <w:rPr>
-          <w:rFonts w:ascii="Arial" w:hAnsi="Arial" w:cs="Arial"/>
-          <w:sz w:val="36"/>
-          <w:szCs w:val="18"/>
-        </w:rPr>
-        <w:t>○</w:t>
-      </w:r>
-      <w:r>
-        <w:rPr>
-          <w:rFonts w:ascii="Verdana" w:hAnsi="Verdana"/>
-          <w:sz w:val="18"/>
-          <w:szCs w:val="18"/>
-        </w:rPr>
-        <w:t xml:space="preserve"> Se</w:t>
+        <w:t>1. A página inicial do RECUPERA-SOLO é aberta.</w:t>
+      </w:r>
+    </w:p>
+    <w:p>
+      <w:pPr>
+        <w:rPr>
+          <w:rFonts w:ascii="Verdana" w:hAnsi="Verdana"/>
+          <w:sz w:val="18"/>
+          <w:szCs w:val="18"/>
+        </w:rPr>
+      </w:pPr>
+      <w:r>
+        <w:rPr>
+          <w:rFonts w:ascii="Verdana" w:hAnsi="Verdana"/>
+          <w:sz w:val="18"/>
+          <w:szCs w:val="18"/>
+        </w:rPr>
+        <w:t>2. A área de entrada de dados para diagnóstico e cálculo de recuperação de solos sódicos é localizada.</w:t>
+      </w:r>
+    </w:p>
+    <w:p>
+      <w:pPr>
+        <w:rPr>
+          <w:rFonts w:ascii="Verdana" w:hAnsi="Verdana"/>
+          <w:sz w:val="18"/>
+          <w:szCs w:val="18"/>
+        </w:rPr>
+      </w:pPr>
+      <w:r>
+        <w:rPr>
+          <w:rFonts w:ascii="Verdana" w:hAnsi="Verdana"/>
+          <w:sz w:val="18"/>
+          <w:szCs w:val="18"/>
+        </w:rPr>
+        <w:t>3. As informações do solo solicitadas são identificadas, assim como o texto de apoio que traz faixa e exemplo em cada campo.</w:t>
+      </w:r>
+    </w:p>
+    <w:p>
+      <w:pPr>
+        <w:rPr>
+          <w:rFonts w:ascii="Verdana" w:hAnsi="Verdana"/>
+          <w:sz w:val="18"/>
+          <w:szCs w:val="18"/>
+        </w:rPr>
+      </w:pPr>
+      <w:r>
+        <w:rPr>
+          <w:rFonts w:ascii="Verdana" w:hAnsi="Verdana"/>
+          <w:sz w:val="18"/>
+          <w:szCs w:val="18"/>
+        </w:rPr>
+        <w:t>4. Responda: em qual seção está o campo Drenagem?</w:t>
+      </w:r>
+    </w:p>
+    <w:p>
+      <w:pPr>
+        <w:rPr>
+          <w:rFonts w:ascii="Verdana" w:hAnsi="Verdana"/>
+          <w:sz w:val="18"/>
+          <w:szCs w:val="18"/>
+        </w:rPr>
+      </w:pPr>
+      <w:r>
+        <w:rPr>
+          <w:rFonts w:ascii="Arial" w:hAnsi="Arial" w:cs="Arial"/>
+          <w:sz w:val="36"/>
+          <w:szCs w:val="18"/>
+        </w:rPr>
+        <w:t>○</w:t>
       </w:r>
       <w:r>
         <w:rPr>
@@ -390,31 +389,15 @@
           <w:sz w:val="18"/>
           <w:szCs w:val="18"/>
         </w:rPr>
-        <w:t>çã</w:t>
-      </w:r>
-      <w:r>
-        <w:rPr>
-          <w:rFonts w:ascii="Verdana" w:hAnsi="Verdana"/>
-          <w:sz w:val="18"/>
-          <w:szCs w:val="18"/>
-        </w:rPr>
-        <w:t xml:space="preserve">o 1 - Escolha como iniciar   </w:t>
-      </w:r>
-      <w:r>
-        <w:rPr>
-          <w:rFonts w:ascii="Arial" w:hAnsi="Arial" w:cs="Arial"/>
-          <w:sz w:val="36"/>
-          <w:szCs w:val="18"/>
-        </w:rPr>
-        <w:t>○</w:t>
-      </w:r>
-      <w:r>
-        <w:rPr>
-          <w:rFonts w:ascii="Verdana" w:hAnsi="Verdana"/>
-          <w:sz w:val="18"/>
-          <w:szCs w:val="18"/>
-        </w:rPr>
-        <w:t xml:space="preserve"> Se</w:t>
+        <w:t xml:space="preserve"> Seção 1 - Escolha como iniciar   </w:t>
+      </w:r>
+      <w:r>
+        <w:rPr>
+          <w:rFonts w:ascii="Arial" w:hAnsi="Arial" w:cs="Arial"/>
+          <w:sz w:val="36"/>
+          <w:szCs w:val="18"/>
+        </w:rPr>
+        <w:t>○</w:t>
       </w:r>
       <w:r>
         <w:rPr>
@@ -422,19 +405,11 @@
           <w:sz w:val="18"/>
           <w:szCs w:val="18"/>
         </w:rPr>
-        <w:t>çã</w:t>
-      </w:r>
-      <w:r>
-        <w:rPr>
-          <w:rFonts w:ascii="Verdana" w:hAnsi="Verdana"/>
-          <w:sz w:val="18"/>
-          <w:szCs w:val="18"/>
-        </w:rPr>
-        <w:t>o 2 - Dados de entrada</w:t>
-      </w:r>
-      <w:r>
-        <w:rPr>
-          <w:rFonts w:ascii="Verdana" w:hAnsi="Verdana"/>
+        <w:t xml:space="preserve"> Seção 2 - Dados de entrada</w:t>
+      </w:r>
+      <w:r>
+        <w:rPr>
+          <w:rFonts w:ascii="Verdana" w:hAnsi="Verdana" w:cs="Verdana"/>
           <w:sz w:val="18"/>
           <w:szCs w:val="18"/>
         </w:rPr>
@@ -450,43 +425,19 @@
       </w:r>
       <w:r>
         <w:rPr>
-          <w:rFonts w:ascii="Verdana" w:hAnsi="Verdana"/>
-          <w:sz w:val="18"/>
-          <w:szCs w:val="18"/>
-        </w:rPr>
-        <w:t xml:space="preserve"> Se</w:t>
-      </w:r>
-      <w:r>
-        <w:rPr>
           <w:rFonts w:ascii="Verdana" w:hAnsi="Verdana" w:cs="Verdana"/>
           <w:sz w:val="18"/>
           <w:szCs w:val="18"/>
         </w:rPr>
-        <w:t>çã</w:t>
-      </w:r>
-      <w:r>
-        <w:rPr>
-          <w:rFonts w:ascii="Verdana" w:hAnsi="Verdana"/>
-          <w:sz w:val="18"/>
-          <w:szCs w:val="18"/>
-        </w:rPr>
-        <w:t xml:space="preserve">o 3 - Corretivos e custos   </w:t>
-      </w:r>
-      <w:r>
-        <w:rPr>
-          <w:rFonts w:ascii="Arial" w:hAnsi="Arial" w:cs="Arial"/>
-          <w:sz w:val="36"/>
-          <w:szCs w:val="18"/>
-        </w:rPr>
-        <w:t>○</w:t>
-      </w:r>
-      <w:r>
-        <w:rPr>
-          <w:rFonts w:ascii="Verdana" w:hAnsi="Verdana"/>
-          <w:sz w:val="18"/>
-          <w:szCs w:val="18"/>
-        </w:rPr>
-        <w:t xml:space="preserve"> N</w:t>
+        <w:t xml:space="preserve"> Seção 3 - Corretivos e custos   </w:t>
+      </w:r>
+      <w:r>
+        <w:rPr>
+          <w:rFonts w:ascii="Arial" w:hAnsi="Arial" w:cs="Arial"/>
+          <w:sz w:val="36"/>
+          <w:szCs w:val="18"/>
+        </w:rPr>
+        <w:t>○</w:t>
       </w:r>
       <w:r>
         <w:rPr>
@@ -494,15 +445,40 @@
           <w:sz w:val="18"/>
           <w:szCs w:val="18"/>
         </w:rPr>
-        <w:t>ã</w:t>
-      </w:r>
-      <w:r>
-        <w:rPr>
-          <w:rFonts w:ascii="Verdana" w:hAnsi="Verdana"/>
-          <w:sz w:val="18"/>
-          <w:szCs w:val="18"/>
-        </w:rPr>
-        <w:t>o sei</w:t>
+        <w:t xml:space="preserve"> Seção 4 - Resultados integrados   </w:t>
+      </w:r>
+      <w:r>
+        <w:rPr>
+          <w:rFonts w:ascii="Arial" w:hAnsi="Arial" w:cs="Arial"/>
+          <w:sz w:val="36"/>
+          <w:szCs w:val="18"/>
+        </w:rPr>
+        <w:t>○</w:t>
+      </w:r>
+      <w:r>
+        <w:rPr>
+          <w:rFonts w:ascii="Verdana" w:hAnsi="Verdana" w:cs="Verdana"/>
+          <w:sz w:val="18"/>
+          <w:szCs w:val="18"/>
+        </w:rPr>
+        <w:t xml:space="preserve"> Não sei</w:t>
+      </w:r>
+    </w:p>
+    <w:p>
+      <w:pPr>
+        <w:rPr>
+          <w:rFonts w:ascii="Verdana" w:hAnsi="Verdana"/>
+          <w:sz w:val="18"/>
+          <w:szCs w:val="18"/>
+        </w:rPr>
+      </w:pPr>
+      <w:r>
+        <w:rPr>
+          <w:rFonts w:ascii="Verdana" w:hAnsi="Verdana"/>
+          <w:sz w:val="18"/>
+          <w:szCs w:val="18"/>
+        </w:rPr>
+        <w:t>5. Responda: no celular, qual botão da barra inferior inicia o cálculo a partir de qualquer ponto da página? ______________________________</w:t>
       </w:r>
     </w:p>
     <w:p>
@@ -721,66 +697,75 @@
           <w:sz w:val="18"/>
           <w:szCs w:val="18"/>
         </w:rPr>
-        <w:t>1. Utilize o Caso 1 do Apêndice D e preencha os valores nos campos correspondentes.</w:t>
-      </w:r>
-    </w:p>
-    <w:p>
-      <w:pPr>
-        <w:rPr>
-          <w:rFonts w:ascii="Verdana" w:hAnsi="Verdana"/>
-          <w:sz w:val="18"/>
-          <w:szCs w:val="18"/>
-        </w:rPr>
-      </w:pPr>
-      <w:r>
-        <w:rPr>
-          <w:rFonts w:ascii="Verdana" w:hAnsi="Verdana"/>
-          <w:sz w:val="18"/>
-          <w:szCs w:val="18"/>
-        </w:rPr>
-        <w:t xml:space="preserve">2. Verifique unidades, profundidade e demais parâmetros </w:t>
-      </w:r>
-      <w:r>
-        <w:rPr>
-          <w:rFonts w:ascii="Verdana" w:hAnsi="Verdana"/>
-          <w:sz w:val="18"/>
-          <w:szCs w:val="18"/>
-        </w:rPr>
-        <w:t>exigidos.</w:t>
-      </w:r>
-    </w:p>
-    <w:p>
-      <w:pPr>
-        <w:rPr>
-          <w:rFonts w:ascii="Verdana" w:hAnsi="Verdana"/>
-          <w:sz w:val="18"/>
-          <w:szCs w:val="18"/>
-        </w:rPr>
-      </w:pPr>
-      <w:r>
-        <w:rPr>
-          <w:rFonts w:ascii="Verdana" w:hAnsi="Verdana"/>
-          <w:sz w:val="18"/>
-          <w:szCs w:val="18"/>
-        </w:rPr>
-        <w:t>3. Digite os valores do Caso 1.</w:t>
-      </w:r>
-    </w:p>
-    <w:p>
-      <w:pPr>
-        <w:rPr>
-          <w:rFonts w:ascii="Verdana" w:hAnsi="Verdana"/>
-          <w:sz w:val="18"/>
-          <w:szCs w:val="18"/>
-        </w:rPr>
-      </w:pPr>
-      <w:r>
-        <w:rPr>
-          <w:rFonts w:ascii="Verdana" w:hAnsi="Verdana"/>
-          <w:sz w:val="18"/>
-          <w:szCs w:val="18"/>
-        </w:rPr>
-        <w:t>4. Gere o diagnóstico e a recomendação.</w:t>
+        <w:t>1. O Caso 1 do Apêndice D é usado no preenchimento dos campos correspondentes. O botão Usar exemplo pode ser acionado antes, para a observação de um caso pronto, e o botão Nova análise limpa os campos.</w:t>
+      </w:r>
+    </w:p>
+    <w:p>
+      <w:pPr>
+        <w:rPr>
+          <w:rFonts w:ascii="Verdana" w:hAnsi="Verdana"/>
+          <w:sz w:val="18"/>
+          <w:szCs w:val="18"/>
+        </w:rPr>
+      </w:pPr>
+      <w:r>
+        <w:rPr>
+          <w:rFonts w:ascii="Verdana" w:hAnsi="Verdana"/>
+          <w:sz w:val="18"/>
+          <w:szCs w:val="18"/>
+        </w:rPr>
+        <w:t>2. As unidades, a profundidade e os demais parâmetros são verificados.</w:t>
+      </w:r>
+    </w:p>
+    <w:p>
+      <w:pPr>
+        <w:rPr>
+          <w:rFonts w:ascii="Verdana" w:hAnsi="Verdana"/>
+          <w:sz w:val="18"/>
+          <w:szCs w:val="18"/>
+        </w:rPr>
+      </w:pPr>
+      <w:r>
+        <w:rPr>
+          <w:rFonts w:ascii="Verdana" w:hAnsi="Verdana"/>
+          <w:sz w:val="18"/>
+          <w:szCs w:val="18"/>
+        </w:rPr>
+        <w:t>3. Os valores do Caso 1 são digitados; o número aparece em negrito dentro da caixa, e a dica permanece sob o campo.</w:t>
+      </w:r>
+    </w:p>
+    <w:p>
+      <w:pPr>
+        <w:rPr>
+          <w:rFonts w:ascii="Verdana" w:hAnsi="Verdana"/>
+          <w:sz w:val="18"/>
+          <w:szCs w:val="18"/>
+        </w:rPr>
+      </w:pPr>
+      <w:r>
+        <w:rPr>
+          <w:rFonts w:ascii="Verdana" w:hAnsi="Verdana"/>
+          <w:sz w:val="18"/>
+          <w:szCs w:val="18"/>
+        </w:rPr>
+        <w:t>4. O botão Gerar diagnóstico e recomendação é acionado. A tecla Enter em qualquer campo produz o mesmo envio.</w:t>
+      </w:r>
+    </w:p>
+    <w:p>
+      <w:pPr>
+        <w:rPr>
+          <w:rFonts w:ascii="Verdana" w:hAnsi="Verdana"/>
+          <w:sz w:val="18"/>
+          <w:szCs w:val="18"/>
+        </w:rPr>
+      </w:pPr>
+      <w:r>
+        <w:rPr>
+          <w:rFonts w:ascii="Verdana" w:hAnsi="Verdana"/>
+          <w:sz w:val="18"/>
+          <w:szCs w:val="18"/>
+        </w:rPr>
+        <w:t>5. A página rola sozinha até a seção Resultados integrados, e o resultado é anunciado pelo leitor de tela.</w:t>
       </w:r>
     </w:p>
     <w:p>
@@ -993,41 +978,58 @@
           <w:sz w:val="18"/>
           <w:szCs w:val="18"/>
         </w:rPr>
-        <w:t>1. Localize a informação relativa à sodicidade e à necessidade de correção.</w:t>
-      </w:r>
-    </w:p>
-    <w:p>
-      <w:pPr>
-        <w:rPr>
-          <w:rFonts w:ascii="Verdana" w:hAnsi="Verdana"/>
-          <w:sz w:val="18"/>
-          <w:szCs w:val="18"/>
-        </w:rPr>
-      </w:pPr>
-      <w:r>
-        <w:rPr>
-          <w:rFonts w:ascii="Verdana" w:hAnsi="Verdana"/>
-          <w:sz w:val="18"/>
-          <w:szCs w:val="18"/>
-        </w:rPr>
-        <w:t>2. Fale, em voz alta e com suas palavras, o que o resultado significa.</w:t>
-      </w:r>
-    </w:p>
-    <w:p>
-      <w:pPr>
-        <w:rPr>
-          <w:rFonts w:ascii="Verdana" w:hAnsi="Verdana"/>
-          <w:sz w:val="18"/>
-          <w:szCs w:val="18"/>
-        </w:rPr>
-      </w:pPr>
-      <w:r>
-        <w:rPr>
-          <w:rFonts w:ascii="Verdana" w:hAnsi="Verdana"/>
-          <w:sz w:val="18"/>
-          <w:szCs w:val="18"/>
-        </w:rPr>
-        <w:t xml:space="preserve">3. Identifique alertas, limitações ou orientações sobre lixiviação e drenagem e responda: </w:t>
+        <w:t>1. A informação relativa à sodicidade e à necessidade de correção é localizada no cartão Diagnóstico do solo.</w:t>
+      </w:r>
+    </w:p>
+    <w:p>
+      <w:pPr>
+        <w:rPr>
+          <w:rFonts w:ascii="Verdana" w:hAnsi="Verdana"/>
+          <w:sz w:val="18"/>
+          <w:szCs w:val="18"/>
+        </w:rPr>
+      </w:pPr>
+      <w:r>
+        <w:rPr>
+          <w:rFonts w:ascii="Verdana" w:hAnsi="Verdana"/>
+          <w:sz w:val="18"/>
+          <w:szCs w:val="18"/>
+        </w:rPr>
+        <w:t>2. O significado do resultado é explicado em voz alta, com palavras próprias.</w:t>
+      </w:r>
+    </w:p>
+    <w:p>
+      <w:pPr>
+        <w:rPr>
+          <w:rFonts w:ascii="Verdana" w:hAnsi="Verdana"/>
+          <w:sz w:val="18"/>
+          <w:szCs w:val="18"/>
+        </w:rPr>
+      </w:pPr>
+      <w:r>
+        <w:rPr>
+          <w:rFonts w:ascii="Verdana" w:hAnsi="Verdana"/>
+          <w:sz w:val="18"/>
+          <w:szCs w:val="18"/>
+        </w:rPr>
+        <w:t>3. Os alertas, as limitações e as orientações sobre lixiviação e drenagem são identificados, e as questões a seguir são respondidas:</w:t>
+      </w:r>
+    </w:p>
+    <w:p>
+      <w:pPr>
+        <w:rPr>
+          <w:rFonts w:ascii="Verdana" w:hAnsi="Verdana"/>
+          <w:sz w:val="18"/>
+          <w:szCs w:val="18"/>
+        </w:rPr>
+      </w:pPr>
+      <w:r>
+        <w:rPr>
+          <w:rFonts w:ascii="Verdana" w:hAnsi="Verdana"/>
+          <w:sz w:val="18"/>
+          <w:szCs w:val="18"/>
+        </w:rPr>
+        <w:t>4. O cartão Recomendação técnica é lido, e a adequação de cada corretivo é conferida.</w:t>
       </w:r>
     </w:p>
     <w:p>
@@ -1253,58 +1255,58 @@
           <w:sz w:val="18"/>
           <w:szCs w:val="18"/>
         </w:rPr>
-        <w:t>1. Na seção Corretivos e custos, selecione o gesso agrícola e outro corretivo disponível.</w:t>
-      </w:r>
-    </w:p>
-    <w:p>
-      <w:pPr>
-        <w:rPr>
-          <w:rFonts w:ascii="Verdana" w:hAnsi="Verdana"/>
-          <w:sz w:val="18"/>
-          <w:szCs w:val="18"/>
-        </w:rPr>
-      </w:pPr>
-      <w:r>
-        <w:rPr>
-          <w:rFonts w:ascii="Verdana" w:hAnsi="Verdana"/>
-          <w:sz w:val="18"/>
-          <w:szCs w:val="18"/>
-        </w:rPr>
-        <w:t>2. Gere o diagnóstico e a recomendação.</w:t>
-      </w:r>
-    </w:p>
-    <w:p>
-      <w:pPr>
-        <w:rPr>
-          <w:rFonts w:ascii="Verdana" w:hAnsi="Verdana"/>
-          <w:sz w:val="18"/>
-          <w:szCs w:val="18"/>
-        </w:rPr>
-      </w:pPr>
-      <w:r>
-        <w:rPr>
-          <w:rFonts w:ascii="Verdana" w:hAnsi="Verdana"/>
-          <w:sz w:val="18"/>
-          <w:szCs w:val="18"/>
-        </w:rPr>
-        <w:t>3. Em Resultados integrados, localize a justificativa apresentada para cada corretivo.</w:t>
-      </w:r>
-    </w:p>
-    <w:p>
-      <w:pPr>
-        <w:rPr>
-          <w:rFonts w:ascii="Verdana" w:hAnsi="Verdana"/>
-          <w:sz w:val="18"/>
-          <w:szCs w:val="18"/>
-        </w:rPr>
-      </w:pPr>
-      <w:r>
-        <w:rPr>
-          <w:rFonts w:ascii="Verdana" w:hAnsi="Verdana"/>
-          <w:sz w:val="18"/>
-          <w:szCs w:val="18"/>
-        </w:rPr>
-        <w:t>4. Compare as justificativas e a adequação dos dois corretivos.</w:t>
+        <w:t>1. Na seção Corretivos e custos, o gesso agrícola e outro corretivo disponível são marcados na caixa de seleção de cada cartão.</w:t>
+      </w:r>
+    </w:p>
+    <w:p>
+      <w:pPr>
+        <w:rPr>
+          <w:rFonts w:ascii="Verdana" w:hAnsi="Verdana"/>
+          <w:sz w:val="18"/>
+          <w:szCs w:val="18"/>
+        </w:rPr>
+      </w:pPr>
+      <w:r>
+        <w:rPr>
+          <w:rFonts w:ascii="Verdana" w:hAnsi="Verdana"/>
+          <w:sz w:val="18"/>
+          <w:szCs w:val="18"/>
+        </w:rPr>
+        <w:t>2. A pureza de cada corretivo marcado é informada.</w:t>
+      </w:r>
+    </w:p>
+    <w:p>
+      <w:pPr>
+        <w:rPr>
+          <w:rFonts w:ascii="Verdana" w:hAnsi="Verdana"/>
+          <w:sz w:val="18"/>
+          <w:szCs w:val="18"/>
+        </w:rPr>
+      </w:pPr>
+      <w:r>
+        <w:rPr>
+          <w:rFonts w:ascii="Verdana" w:hAnsi="Verdana"/>
+          <w:sz w:val="18"/>
+          <w:szCs w:val="18"/>
+        </w:rPr>
+        <w:t>3. O diagnóstico é gerado e, em Resultados integrados, a justificativa apresentada para cada corretivo é localizada.</w:t>
+      </w:r>
+    </w:p>
+    <w:p>
+      <w:pPr>
+        <w:rPr>
+          <w:rFonts w:ascii="Verdana" w:hAnsi="Verdana"/>
+          <w:sz w:val="18"/>
+          <w:szCs w:val="18"/>
+        </w:rPr>
+      </w:pPr>
+      <w:r>
+        <w:rPr>
+          <w:rFonts w:ascii="Verdana" w:hAnsi="Verdana"/>
+          <w:sz w:val="18"/>
+          <w:szCs w:val="18"/>
+        </w:rPr>
+        <w:t>4. As justificativas e a adequação dos dois corretivos são comparadas.</w:t>
       </w:r>
     </w:p>
     <w:p>
@@ -1523,49 +1525,58 @@
           <w:sz w:val="18"/>
           <w:szCs w:val="18"/>
         </w:rPr>
-        <w:t>1. Para o Caso 1, localize a dose teórica, a dose prática e a dose comercial.</w:t>
-      </w:r>
-    </w:p>
-    <w:p>
-      <w:pPr>
-        <w:rPr>
-          <w:rFonts w:ascii="Verdana" w:hAnsi="Verdana"/>
-          <w:sz w:val="18"/>
-          <w:szCs w:val="18"/>
-        </w:rPr>
-      </w:pPr>
-      <w:r>
-        <w:rPr>
-          <w:rFonts w:ascii="Verdana" w:hAnsi="Verdana"/>
-          <w:sz w:val="18"/>
-          <w:szCs w:val="18"/>
-        </w:rPr>
-        <w:t>2. Informe qual unidade é utilizada em cada resultado e verifique se a pureza e o preço podem ser ajustados.</w:t>
-      </w:r>
-    </w:p>
-    <w:p>
-      <w:pPr>
-        <w:rPr>
-          <w:rFonts w:ascii="Verdana" w:hAnsi="Verdana"/>
-          <w:sz w:val="18"/>
-          <w:szCs w:val="18"/>
-        </w:rPr>
-      </w:pPr>
-      <w:r>
-        <w:rPr>
-          <w:rFonts w:ascii="Verdana" w:hAnsi="Verdana"/>
-          <w:sz w:val="18"/>
-          <w:szCs w:val="18"/>
-        </w:rPr>
-        <w:t>3. Informe a pureza (85%) e o preço</w:t>
-      </w:r>
-      <w:r>
-        <w:rPr>
-          <w:rFonts w:ascii="Verdana" w:hAnsi="Verdana"/>
-          <w:sz w:val="18"/>
-          <w:szCs w:val="18"/>
-        </w:rPr>
-        <w:t xml:space="preserve"> (R$ 400/t) do gesso agrícola.</w:t>
+        <w:t>1. Para o Caso 1, a dose teórica, a dose prática e a dose comercial são localizadas na tabela Dose e custo.</w:t>
+      </w:r>
+    </w:p>
+    <w:p>
+      <w:pPr>
+        <w:rPr>
+          <w:rFonts w:ascii="Verdana" w:hAnsi="Verdana"/>
+          <w:sz w:val="18"/>
+          <w:szCs w:val="18"/>
+        </w:rPr>
+      </w:pPr>
+      <w:r>
+        <w:rPr>
+          <w:rFonts w:ascii="Verdana" w:hAnsi="Verdana"/>
+          <w:sz w:val="18"/>
+          <w:szCs w:val="18"/>
+        </w:rPr>
+        <w:t>2. A unidade de cada resultado é informada, e a possibilidade de ajustar a pureza e o preço é verificada.</w:t>
+      </w:r>
+    </w:p>
+    <w:p>
+      <w:pPr>
+        <w:rPr>
+          <w:rFonts w:ascii="Verdana" w:hAnsi="Verdana"/>
+          <w:sz w:val="18"/>
+          <w:szCs w:val="18"/>
+        </w:rPr>
+      </w:pPr>
+      <w:r>
+        <w:rPr>
+          <w:rFonts w:ascii="Verdana" w:hAnsi="Verdana"/>
+          <w:sz w:val="18"/>
+          <w:szCs w:val="18"/>
+        </w:rPr>
+        <w:t>3. A pureza (85%) e o preço (R$ 400/t) do gesso agrícola são informados.</w:t>
+      </w:r>
+    </w:p>
+    <w:p>
+      <w:pPr>
+        <w:rPr>
+          <w:rFonts w:ascii="Verdana" w:hAnsi="Verdana"/>
+          <w:sz w:val="18"/>
+          <w:szCs w:val="18"/>
+        </w:rPr>
+      </w:pPr>
+      <w:r>
+        <w:rPr>
+          <w:rFonts w:ascii="Verdana" w:hAnsi="Verdana"/>
+          <w:sz w:val="18"/>
+          <w:szCs w:val="18"/>
+        </w:rPr>
+        <w:t>4. O botão Compartilhar resumo é acionado, o texto do resumo é conferido e a origem do compartilhamento é registrada (aplicativo, Web Share ou cópia).</w:t>
       </w:r>
     </w:p>
     <w:p>
@@ -1794,49 +1805,58 @@
           <w:sz w:val="18"/>
           <w:szCs w:val="18"/>
         </w:rPr>
-        <w:t>1. Utilize o Caso 2 do Apêndice D para uma nova simulação.</w:t>
-      </w:r>
-    </w:p>
-    <w:p>
-      <w:pPr>
-        <w:rPr>
-          <w:rFonts w:ascii="Verdana" w:hAnsi="Verdana"/>
-          <w:sz w:val="18"/>
-          <w:szCs w:val="18"/>
-        </w:rPr>
-      </w:pPr>
-      <w:r>
-        <w:rPr>
-          <w:rFonts w:ascii="Verdana" w:hAnsi="Verdana"/>
-          <w:sz w:val="18"/>
-          <w:szCs w:val="18"/>
-        </w:rPr>
-        <w:t>2. Compare os resultados com os do Caso 1 e explique as diferenças percebidas.</w:t>
-      </w:r>
-    </w:p>
-    <w:p>
-      <w:pPr>
-        <w:rPr>
-          <w:rFonts w:ascii="Verdana" w:hAnsi="Verdana"/>
-          <w:sz w:val="18"/>
-          <w:szCs w:val="18"/>
-        </w:rPr>
-      </w:pPr>
-      <w:r>
-        <w:rPr>
-          <w:rFonts w:ascii="Verdana" w:hAnsi="Verdana"/>
-          <w:sz w:val="18"/>
-          <w:szCs w:val="18"/>
-        </w:rPr>
-        <w:t>3. Informe a pureza (70%) e o preço</w:t>
-      </w:r>
-      <w:r>
-        <w:rPr>
-          <w:rFonts w:ascii="Verdana" w:hAnsi="Verdana"/>
-          <w:sz w:val="18"/>
-          <w:szCs w:val="18"/>
-        </w:rPr>
-        <w:t xml:space="preserve"> (R$ 520/t) do gesso agrícola.</w:t>
+        <w:t>1. O Caso 2 do Apêndice D é usado em uma nova simulação. Antes, o botão Nova análise é acionado, e o diálogo Limpar os dados? é observado: o Cancelar mantém o preenchimento, e o Limpar apaga campos e resultados.</w:t>
+      </w:r>
+    </w:p>
+    <w:p>
+      <w:pPr>
+        <w:rPr>
+          <w:rFonts w:ascii="Verdana" w:hAnsi="Verdana"/>
+          <w:sz w:val="18"/>
+          <w:szCs w:val="18"/>
+        </w:rPr>
+      </w:pPr>
+      <w:r>
+        <w:rPr>
+          <w:rFonts w:ascii="Verdana" w:hAnsi="Verdana"/>
+          <w:sz w:val="18"/>
+          <w:szCs w:val="18"/>
+        </w:rPr>
+        <w:t>2. Os resultados são comparados com os do Caso 1, e as diferenças percebidas são explicadas.</w:t>
+      </w:r>
+    </w:p>
+    <w:p>
+      <w:pPr>
+        <w:rPr>
+          <w:rFonts w:ascii="Verdana" w:hAnsi="Verdana"/>
+          <w:sz w:val="18"/>
+          <w:szCs w:val="18"/>
+        </w:rPr>
+      </w:pPr>
+      <w:r>
+        <w:rPr>
+          <w:rFonts w:ascii="Verdana" w:hAnsi="Verdana"/>
+          <w:sz w:val="18"/>
+          <w:szCs w:val="18"/>
+        </w:rPr>
+        <w:t>3. A pureza (70%) e o preço (R$ 520/t) do gesso agrícola são informados.</w:t>
+      </w:r>
+    </w:p>
+    <w:p>
+      <w:pPr>
+        <w:rPr>
+          <w:rFonts w:ascii="Verdana" w:hAnsi="Verdana"/>
+          <w:sz w:val="18"/>
+          <w:szCs w:val="18"/>
+        </w:rPr>
+      </w:pPr>
+      <w:r>
+        <w:rPr>
+          <w:rFonts w:ascii="Verdana" w:hAnsi="Verdana"/>
+          <w:sz w:val="18"/>
+          <w:szCs w:val="18"/>
+        </w:rPr>
+        <w:t>4. O botão Voltar ao início é acionado ao final da leitura, e o retorno ao formulário é observado.</w:t>
       </w:r>
     </w:p>
     <w:p>
@@ -2004,28 +2024,31 @@
     </w:p>
     <w:p/>
     <w:p>
+      <w:pPr>
+        <w:pStyle w:val="Ttulo2"/>
+      </w:pPr>
       <w:r>
         <w:t>TAREFA G - Usar sem internet</w:t>
       </w:r>
     </w:p>
     <w:p>
       <w:r>
-        <w:t>1. Instale o APK no aparelho e abra o aplicativo.</w:t>
-      </w:r>
-    </w:p>
-    <w:p>
-      <w:r>
-        <w:t>2. Ative o modo avião.</w:t>
-      </w:r>
-    </w:p>
-    <w:p>
-      <w:r>
-        <w:t>3. Repita o Caso 1 e gere o diagnóstico.</w:t>
-      </w:r>
-    </w:p>
-    <w:p>
-      <w:r>
-        <w:t>4. Compare o resultado com o obtido no navegador.</w:t>
+        <w:t>1. O APK é instalado no aparelho e o aplicativo é aberto; a barra de status e a tela de abertura aparecem na cor do site.</w:t>
+      </w:r>
+    </w:p>
+    <w:p>
+      <w:r>
+        <w:t>2. O modo avião é ativado.</w:t>
+      </w:r>
+    </w:p>
+    <w:p>
+      <w:r>
+        <w:t>3. O Caso 1 é repetido e o diagnóstico é gerado.</w:t>
+      </w:r>
+    </w:p>
+    <w:p>
+      <w:r>
+        <w:t>4. O resultado é comparado com o obtido no navegador.</w:t>
       </w:r>
     </w:p>
     <w:p>
@@ -2035,33 +2058,249 @@
     </w:p>
     <w:p/>
     <w:p>
+      <w:pPr>
+        <w:pStyle w:val="Ttulo2"/>
+      </w:pPr>
       <w:r>
         <w:t>TAREFA H - Corrigir um valor inválido</w:t>
       </w:r>
     </w:p>
     <w:p>
       <w:r>
-        <w:t>1. No campo pH, tente digitar uma letra.</w:t>
-      </w:r>
-    </w:p>
-    <w:p>
-      <w:r>
-        <w:t>2. Verifique se o caractere entrou no campo.</w:t>
-      </w:r>
-    </w:p>
-    <w:p>
-      <w:r>
-        <w:t>3. Informe pH 15 e gere o diagnóstico.</w:t>
-      </w:r>
-    </w:p>
-    <w:p>
-      <w:r>
-        <w:t>4. Leia a mensagem apresentada e corrija o valor.</w:t>
+        <w:t>1. No campo pH, uma letra é digitada.</w:t>
+      </w:r>
+    </w:p>
+    <w:p>
+      <w:r>
+        <w:t>2. A permanência do caractere no campo é verificada.</w:t>
+      </w:r>
+    </w:p>
+    <w:p>
+      <w:r>
+        <w:t>3. O pH 15 é informado; o aviso surge durante a digitação e o valor é recusado no envio.</w:t>
+      </w:r>
+    </w:p>
+    <w:p>
+      <w:r>
+        <w:t>4. A mensagem apresentada é lida, o resumo de erros no topo é localizado e o valor é corrigido; o aviso desaparece.</w:t>
       </w:r>
     </w:p>
     <w:p>
       <w:r>
         <w:t>A mensagem indicou o campo e a faixa aceita?  ( ) Sim   ( ) Em parte   ( ) Não</w:t>
+      </w:r>
+    </w:p>
+    <w:p>
+      <w:pPr>
+        <w:pStyle w:val="Ttulo2"/>
+      </w:pPr>
+      <w:r>
+        <w:t>TAREFA I - Consultar a ajuda do cálculo</w:t>
+      </w:r>
+    </w:p>
+    <w:p>
+      <w:pPr>
+        <w:rPr>
+          <w:rFonts w:ascii="Verdana" w:hAnsi="Verdana"/>
+          <w:sz w:val="18"/>
+          <w:szCs w:val="18"/>
+        </w:rPr>
+      </w:pPr>
+      <w:r>
+        <w:rPr>
+          <w:rFonts w:ascii="Verdana" w:hAnsi="Verdana"/>
+          <w:sz w:val="18"/>
+          <w:szCs w:val="18"/>
+        </w:rPr>
+        <w:t>1. A seção Como o cálculo funciona é aberta, no fim do formulário.</w:t>
+      </w:r>
+    </w:p>
+    <w:p>
+      <w:pPr>
+        <w:rPr>
+          <w:rFonts w:ascii="Verdana" w:hAnsi="Verdana"/>
+          <w:sz w:val="18"/>
+          <w:szCs w:val="18"/>
+        </w:rPr>
+      </w:pPr>
+      <w:r>
+        <w:rPr>
+          <w:rFonts w:ascii="Verdana" w:hAnsi="Verdana"/>
+          <w:sz w:val="18"/>
+          <w:szCs w:val="18"/>
+        </w:rPr>
+        <w:t>2. As fórmulas e os coeficientes apresentados são localizados.</w:t>
+      </w:r>
+    </w:p>
+    <w:p>
+      <w:pPr>
+        <w:rPr>
+          <w:rFonts w:ascii="Verdana" w:hAnsi="Verdana"/>
+          <w:sz w:val="18"/>
+          <w:szCs w:val="18"/>
+        </w:rPr>
+      </w:pPr>
+      <w:r>
+        <w:rPr>
+          <w:rFonts w:ascii="Verdana" w:hAnsi="Verdana"/>
+          <w:sz w:val="18"/>
+          <w:szCs w:val="18"/>
+        </w:rPr>
+        <w:t>3. Responda: a ajuda informa como a dose teórica é calculada?  ( ) Sim   ( ) Em parte   ( ) Não</w:t>
+      </w:r>
+    </w:p>
+    <w:p>
+      <w:pPr>
+        <w:rPr>
+          <w:rFonts w:ascii="Verdana" w:hAnsi="Verdana"/>
+          <w:sz w:val="18"/>
+          <w:szCs w:val="18"/>
+        </w:rPr>
+      </w:pPr>
+      <w:r>
+        <w:rPr>
+          <w:rFonts w:ascii="Verdana" w:hAnsi="Verdana"/>
+          <w:sz w:val="18"/>
+          <w:szCs w:val="18"/>
+        </w:rPr>
+        <w:t xml:space="preserve">Concluiu?  </w:t>
+      </w:r>
+      <w:r>
+        <w:rPr>
+          <w:rFonts w:ascii="Arial" w:hAnsi="Arial" w:cs="Arial"/>
+          <w:sz w:val="36"/>
+          <w:szCs w:val="18"/>
+        </w:rPr>
+        <w:t>○</w:t>
+      </w:r>
+      <w:r>
+        <w:rPr>
+          <w:rFonts w:ascii="Verdana" w:hAnsi="Verdana"/>
+          <w:sz w:val="18"/>
+          <w:szCs w:val="18"/>
+        </w:rPr>
+        <w:t xml:space="preserve"> Sim, sem ajuda   </w:t>
+      </w:r>
+      <w:r>
+        <w:rPr>
+          <w:rFonts w:ascii="Arial" w:hAnsi="Arial" w:cs="Arial"/>
+          <w:sz w:val="36"/>
+          <w:szCs w:val="18"/>
+        </w:rPr>
+        <w:t>○</w:t>
+      </w:r>
+      <w:r>
+        <w:rPr>
+          <w:rFonts w:ascii="Verdana" w:hAnsi="Verdana"/>
+          <w:sz w:val="18"/>
+          <w:szCs w:val="18"/>
+        </w:rPr>
+        <w:t xml:space="preserve"> Sim, com dificuldade   </w:t>
+      </w:r>
+      <w:r>
+        <w:rPr>
+          <w:rFonts w:ascii="Arial" w:hAnsi="Arial" w:cs="Arial"/>
+          <w:sz w:val="36"/>
+          <w:szCs w:val="18"/>
+        </w:rPr>
+        <w:t>○</w:t>
+      </w:r>
+      <w:r>
+        <w:rPr>
+          <w:rFonts w:ascii="Verdana" w:hAnsi="Verdana"/>
+          <w:sz w:val="18"/>
+          <w:szCs w:val="18"/>
+        </w:rPr>
+        <w:t xml:space="preserve"> N</w:t>
+      </w:r>
+      <w:r>
+        <w:rPr>
+          <w:rFonts w:ascii="Verdana" w:hAnsi="Verdana" w:cs="Verdana"/>
+          <w:sz w:val="18"/>
+          <w:szCs w:val="18"/>
+        </w:rPr>
+        <w:t>ã</w:t>
+      </w:r>
+      <w:r>
+        <w:rPr>
+          <w:rFonts w:ascii="Verdana" w:hAnsi="Verdana"/>
+          <w:sz w:val="18"/>
+          <w:szCs w:val="18"/>
+        </w:rPr>
+        <w:t xml:space="preserve">o concluiu   </w:t>
+      </w:r>
+      <w:r>
+        <w:rPr>
+          <w:rFonts w:ascii="Arial" w:hAnsi="Arial" w:cs="Arial"/>
+          <w:sz w:val="36"/>
+          <w:szCs w:val="18"/>
+        </w:rPr>
+        <w:t>○</w:t>
+      </w:r>
+      <w:r>
+        <w:rPr>
+          <w:rFonts w:ascii="Verdana" w:hAnsi="Verdana"/>
+          <w:sz w:val="18"/>
+          <w:szCs w:val="18"/>
+        </w:rPr>
+        <w:t xml:space="preserve"> Fun</w:t>
+      </w:r>
+      <w:r>
+        <w:rPr>
+          <w:rFonts w:ascii="Verdana" w:hAnsi="Verdana" w:cs="Verdana"/>
+          <w:sz w:val="18"/>
+          <w:szCs w:val="18"/>
+        </w:rPr>
+        <w:t>çã</w:t>
+      </w:r>
+      <w:r>
+        <w:rPr>
+          <w:rFonts w:ascii="Verdana" w:hAnsi="Verdana"/>
+          <w:sz w:val="18"/>
+          <w:szCs w:val="18"/>
+        </w:rPr>
+        <w:t>o indispon</w:t>
+      </w:r>
+      <w:r>
+        <w:rPr>
+          <w:rFonts w:ascii="Verdana" w:hAnsi="Verdana" w:cs="Verdana"/>
+          <w:sz w:val="18"/>
+          <w:szCs w:val="18"/>
+        </w:rPr>
+        <w:t>í</w:t>
+      </w:r>
+      <w:r>
+        <w:rPr>
+          <w:rFonts w:ascii="Verdana" w:hAnsi="Verdana"/>
+          <w:sz w:val="18"/>
+          <w:szCs w:val="18"/>
+        </w:rPr>
+        <w:t>vel</w:t>
+      </w:r>
+    </w:p>
+    <w:p>
+      <w:pPr>
+        <w:rPr>
+          <w:rFonts w:ascii="Verdana" w:hAnsi="Verdana"/>
+          <w:sz w:val="18"/>
+          <w:szCs w:val="18"/>
+        </w:rPr>
+      </w:pPr>
+      <w:r>
+        <w:rPr>
+          <w:rFonts w:ascii="Verdana" w:hAnsi="Verdana"/>
+          <w:sz w:val="18"/>
+          <w:szCs w:val="18"/>
+        </w:rPr>
+        <w:t xml:space="preserve">Dúvida ou </w:t>
+      </w:r>
+      <w:r>
+        <w:rPr>
+          <w:rFonts w:ascii="Verdana" w:hAnsi="Verdana"/>
+          <w:sz w:val="18"/>
+          <w:szCs w:val="18"/>
+        </w:rPr>
+        <w:t>comentário: ______________________________________________________________</w:t>
       </w:r>
     </w:p>
     <w:p>
@@ -3305,6 +3544,162 @@
           </w:p>
         </w:tc>
       </w:tr>
+      <w:tr>
+        <w:tc>
+          <w:tcPr>
+            <w:tcW w:type="dxa" w:w="1440"/>
+          </w:tcPr>
+          <w:p>
+            <w:r>
+              <w:t>G</w:t>
+            </w:r>
+          </w:p>
+        </w:tc>
+        <w:tc>
+          <w:tcPr>
+            <w:tcW w:type="dxa" w:w="1440"/>
+          </w:tcPr>
+          <w:p>
+            <w:r/>
+          </w:p>
+        </w:tc>
+        <w:tc>
+          <w:tcPr>
+            <w:tcW w:type="dxa" w:w="1440"/>
+          </w:tcPr>
+          <w:p>
+            <w:r/>
+          </w:p>
+        </w:tc>
+        <w:tc>
+          <w:tcPr>
+            <w:tcW w:type="dxa" w:w="1440"/>
+          </w:tcPr>
+          <w:p>
+            <w:r/>
+          </w:p>
+        </w:tc>
+        <w:tc>
+          <w:tcPr>
+            <w:tcW w:type="dxa" w:w="1440"/>
+          </w:tcPr>
+          <w:p>
+            <w:r/>
+          </w:p>
+        </w:tc>
+        <w:tc>
+          <w:tcPr>
+            <w:tcW w:type="dxa" w:w="1440"/>
+          </w:tcPr>
+          <w:p>
+            <w:r/>
+          </w:p>
+        </w:tc>
+      </w:tr>
+      <w:tr>
+        <w:tc>
+          <w:tcPr>
+            <w:tcW w:type="dxa" w:w="1440"/>
+          </w:tcPr>
+          <w:p>
+            <w:r>
+              <w:t>H</w:t>
+            </w:r>
+          </w:p>
+        </w:tc>
+        <w:tc>
+          <w:tcPr>
+            <w:tcW w:type="dxa" w:w="1440"/>
+          </w:tcPr>
+          <w:p>
+            <w:r/>
+          </w:p>
+        </w:tc>
+        <w:tc>
+          <w:tcPr>
+            <w:tcW w:type="dxa" w:w="1440"/>
+          </w:tcPr>
+          <w:p>
+            <w:r/>
+          </w:p>
+        </w:tc>
+        <w:tc>
+          <w:tcPr>
+            <w:tcW w:type="dxa" w:w="1440"/>
+          </w:tcPr>
+          <w:p>
+            <w:r/>
+          </w:p>
+        </w:tc>
+        <w:tc>
+          <w:tcPr>
+            <w:tcW w:type="dxa" w:w="1440"/>
+          </w:tcPr>
+          <w:p>
+            <w:r/>
+          </w:p>
+        </w:tc>
+        <w:tc>
+          <w:tcPr>
+            <w:tcW w:type="dxa" w:w="1440"/>
+          </w:tcPr>
+          <w:p>
+            <w:r/>
+          </w:p>
+        </w:tc>
+      </w:tr>
+      <w:tr>
+        <w:tc>
+          <w:tcPr>
+            <w:tcW w:type="dxa" w:w="1440"/>
+          </w:tcPr>
+          <w:p>
+            <w:r>
+              <w:t>I</w:t>
+            </w:r>
+          </w:p>
+        </w:tc>
+        <w:tc>
+          <w:tcPr>
+            <w:tcW w:type="dxa" w:w="1440"/>
+          </w:tcPr>
+          <w:p>
+            <w:r/>
+          </w:p>
+        </w:tc>
+        <w:tc>
+          <w:tcPr>
+            <w:tcW w:type="dxa" w:w="1440"/>
+          </w:tcPr>
+          <w:p>
+            <w:r/>
+          </w:p>
+        </w:tc>
+        <w:tc>
+          <w:tcPr>
+            <w:tcW w:type="dxa" w:w="1440"/>
+          </w:tcPr>
+          <w:p>
+            <w:r/>
+          </w:p>
+        </w:tc>
+        <w:tc>
+          <w:tcPr>
+            <w:tcW w:type="dxa" w:w="1440"/>
+          </w:tcPr>
+          <w:p>
+            <w:r/>
+          </w:p>
+        </w:tc>
+        <w:tc>
+          <w:tcPr>
+            <w:tcW w:type="dxa" w:w="1440"/>
+          </w:tcPr>
+          <w:p>
+            <w:r/>
+          </w:p>
+        </w:tc>
+      </w:tr>
     </w:tbl>
     <w:p>
       <w:pPr>
@@ -3630,6 +4025,23 @@
           <w:sz w:val="18"/>
           <w:szCs w:val="18"/>
         </w:rPr>
+        <w:t>• A barra inferior no celular e o botão de retorno ao início foram fáceis de localizar?</w:t>
+      </w:r>
+    </w:p>
+    <w:p>
+      <w:pPr>
+        <w:rPr>
+          <w:rFonts w:ascii="Verdana" w:hAnsi="Verdana"/>
+          <w:sz w:val="18"/>
+          <w:szCs w:val="18"/>
+        </w:rPr>
+      </w:pPr>
+      <w:r>
+        <w:rPr>
+          <w:rFonts w:ascii="Verdana" w:hAnsi="Verdana"/>
+          <w:sz w:val="18"/>
+          <w:szCs w:val="18"/>
+        </w:rPr>
         <w:t>________________________________________________________________________________</w:t>
       </w:r>
     </w:p>
@@ -4994,6 +5406,176 @@
     </w:p>
     <w:p>
       <w:pPr>
+        <w:rPr>
+          <w:rFonts w:ascii="Verdana" w:hAnsi="Verdana"/>
+        </w:rPr>
+      </w:pPr>
+      <w:r>
+        <w:rPr>
+          <w:rFonts w:ascii="Verdana" w:hAnsi="Verdana"/>
+        </w:rPr>
+        <w:t>16. A barra inferior do celular deixou a ação principal ao alcance.</w:t>
+      </w:r>
+    </w:p>
+    <w:p>
+      <w:pPr>
+        <w:rPr>
+          <w:rFonts w:ascii="Verdana" w:hAnsi="Verdana"/>
+        </w:rPr>
+      </w:pPr>
+      <w:r>
+        <w:rPr>
+          <w:rFonts w:ascii="Arial" w:hAnsi="Arial" w:cs="Arial"/>
+          <w:sz w:val="36"/>
+        </w:rPr>
+        <w:t>○</w:t>
+      </w:r>
+      <w:r>
+        <w:rPr>
+          <w:rFonts w:ascii="Verdana" w:hAnsi="Verdana"/>
+        </w:rPr>
+        <w:t xml:space="preserve"> 1   </w:t>
+      </w:r>
+      <w:r>
+        <w:rPr>
+          <w:rFonts w:ascii="Arial" w:hAnsi="Arial" w:cs="Arial"/>
+          <w:sz w:val="36"/>
+        </w:rPr>
+        <w:t>○</w:t>
+      </w:r>
+      <w:r>
+        <w:rPr>
+          <w:rFonts w:ascii="Verdana" w:hAnsi="Verdana"/>
+        </w:rPr>
+        <w:t xml:space="preserve"> 2   </w:t>
+      </w:r>
+      <w:r>
+        <w:rPr>
+          <w:rFonts w:ascii="Arial" w:hAnsi="Arial" w:cs="Arial"/>
+          <w:sz w:val="36"/>
+        </w:rPr>
+        <w:t>○</w:t>
+      </w:r>
+      <w:r>
+        <w:rPr>
+          <w:rFonts w:ascii="Verdana" w:hAnsi="Verdana"/>
+        </w:rPr>
+        <w:t xml:space="preserve"> 3   </w:t>
+      </w:r>
+      <w:r>
+        <w:rPr>
+          <w:rFonts w:ascii="Arial" w:hAnsi="Arial" w:cs="Arial"/>
+          <w:sz w:val="36"/>
+        </w:rPr>
+        <w:t>○</w:t>
+      </w:r>
+      <w:r>
+        <w:rPr>
+          <w:rFonts w:ascii="Verdana" w:hAnsi="Verdana"/>
+        </w:rPr>
+        <w:t xml:space="preserve"> 4   </w:t>
+      </w:r>
+      <w:r>
+        <w:rPr>
+          <w:rFonts w:ascii="Arial" w:hAnsi="Arial" w:cs="Arial"/>
+          <w:sz w:val="36"/>
+        </w:rPr>
+        <w:t>○</w:t>
+      </w:r>
+      <w:r>
+        <w:rPr>
+          <w:rFonts w:ascii="Verdana" w:hAnsi="Verdana"/>
+        </w:rPr>
+        <w:t xml:space="preserve"> 5</w:t>
+      </w:r>
+    </w:p>
+    <w:p>
+      <w:pPr>
+        <w:rPr>
+          <w:rFonts w:ascii="Verdana" w:hAnsi="Verdana"/>
+        </w:rPr>
+      </w:pPr>
+      <w:r>
+        <w:rPr>
+          <w:rFonts w:ascii="Verdana" w:hAnsi="Verdana"/>
+        </w:rPr>
+        <w:t>17. O botão de voltar ao início facilitou a revisão dos dados.</w:t>
+      </w:r>
+    </w:p>
+    <w:p>
+      <w:pPr>
+        <w:rPr>
+          <w:rFonts w:ascii="Verdana" w:hAnsi="Verdana"/>
+        </w:rPr>
+      </w:pPr>
+      <w:r>
+        <w:rPr>
+          <w:rFonts w:ascii="Arial" w:hAnsi="Arial" w:cs="Arial"/>
+          <w:sz w:val="36"/>
+        </w:rPr>
+        <w:t>○</w:t>
+      </w:r>
+      <w:r>
+        <w:rPr>
+          <w:rFonts w:ascii="Verdana" w:hAnsi="Verdana"/>
+        </w:rPr>
+        <w:t xml:space="preserve"> 1   </w:t>
+      </w:r>
+      <w:r>
+        <w:rPr>
+          <w:rFonts w:ascii="Arial" w:hAnsi="Arial" w:cs="Arial"/>
+          <w:sz w:val="36"/>
+        </w:rPr>
+        <w:t>○</w:t>
+      </w:r>
+      <w:r>
+        <w:rPr>
+          <w:rFonts w:ascii="Verdana" w:hAnsi="Verdana"/>
+        </w:rPr>
+        <w:t xml:space="preserve"> 2   </w:t>
+      </w:r>
+      <w:r>
+        <w:rPr>
+          <w:rFonts w:ascii="Arial" w:hAnsi="Arial" w:cs="Arial"/>
+          <w:sz w:val="36"/>
+        </w:rPr>
+        <w:t>○</w:t>
+      </w:r>
+      <w:r>
+        <w:rPr>
+          <w:rFonts w:ascii="Verdana" w:hAnsi="Verdana"/>
+        </w:rPr>
+        <w:t xml:space="preserve"> 3   </w:t>
+      </w:r>
+      <w:r>
+        <w:rPr>
+          <w:rFonts w:ascii="Arial" w:hAnsi="Arial" w:cs="Arial"/>
+          <w:sz w:val="36"/>
+        </w:rPr>
+        <w:t>○</w:t>
+      </w:r>
+      <w:r>
+        <w:rPr>
+          <w:rFonts w:ascii="Verdana" w:hAnsi="Verdana"/>
+        </w:rPr>
+        <w:t xml:space="preserve"> 4   </w:t>
+      </w:r>
+      <w:r>
+        <w:rPr>
+          <w:rFonts w:ascii="Arial" w:hAnsi="Arial" w:cs="Arial"/>
+          <w:sz w:val="36"/>
+        </w:rPr>
+        <w:t>○</w:t>
+      </w:r>
+      <w:r>
+        <w:rPr>
+          <w:rFonts w:ascii="Verdana" w:hAnsi="Verdana"/>
+        </w:rPr>
+        <w:t xml:space="preserve"> 5</w:t>
+      </w:r>
+    </w:p>
+    <w:p>
+      <w:pPr>
         <w:pStyle w:val="Ttulo2"/>
         <w:rPr>
           <w:rFonts w:ascii="Verdana" w:hAnsi="Verdana"/>
@@ -5295,15 +5877,7 @@
           <w:sz w:val="18"/>
           <w:szCs w:val="18"/>
         </w:rPr>
-        <w:t xml:space="preserve">Os casos abaixo são cenários de navegação e consistência, não recomendações agronômicas. Os valores devem ser revisados pela equipe científica e ajustados aos campos </w:t>
-      </w:r>
-      <w:r>
-        <w:rPr>
-          <w:rFonts w:ascii="Verdana" w:hAnsi="Verdana"/>
-          <w:sz w:val="18"/>
-          <w:szCs w:val="18"/>
-        </w:rPr>
-        <w:t>efetivamente exigidos pela versão do RECUPERA-SOLO. Doses obtidas em campo não devem ser utilizadas sem validação técnica.</w:t>
+        <w:t>Os casos abaixo são cenários de navegação e consistência, não recomendações agronômicas. Os valores devem ser revisados pela equipe científica e ajustados aos campos efetivamente exigidos pela versão do RECUPERA-SOLO. Doses obtidas em campo não devem ser utilizadas sem validação técnica. A textura, a drenagem e a qualidade da água são registradas na interface, mas não entram no cálculo.</w:t>
       </w:r>
     </w:p>
     <w:p>

</xml_diff>

<commit_message>
Roteiro de teste de uso reescrito em linguagem imperativa
Os passos voltaram ao imperativo, a pedido: abra, localize, digite, informe, clique e compare. O conteúdo adaptado à interface atual foi mantido.
</commit_message>
<xml_diff>
--- a/RECUPERA-SOLO - Teste de uso.docx
+++ b/RECUPERA-SOLO - Teste de uso.docx
@@ -259,7 +259,7 @@
           <w:sz w:val="18"/>
           <w:szCs w:val="18"/>
         </w:rPr>
-        <w:t>Instruções: as tarefas são executadas sem ajuda, sempre que possível. O que se procura, o que se espera encontrar e o que parece confuso são ditos em voz alta. Os dados dos casos são fictícios, servem exclusivamente ao teste e não constituem prescrição agronômica.</w:t>
+        <w:t>Instruções: execute as tarefas sem ajuda, sempre que possível. Diga em voz alta o que procura, o que espera encontrar e o que considera confuso. Os dados dos casos são fictícios, servem exclusivamente ao teste e não constituem prescrição agronômica.</w:t>
       </w:r>
     </w:p>
     <w:p>
@@ -313,41 +313,41 @@
           <w:sz w:val="18"/>
           <w:szCs w:val="18"/>
         </w:rPr>
-        <w:t>1. A página inicial do RECUPERA-SOLO é aberta.</w:t>
-      </w:r>
-    </w:p>
-    <w:p>
-      <w:pPr>
-        <w:rPr>
-          <w:rFonts w:ascii="Verdana" w:hAnsi="Verdana"/>
-          <w:sz w:val="18"/>
-          <w:szCs w:val="18"/>
-        </w:rPr>
-      </w:pPr>
-      <w:r>
-        <w:rPr>
-          <w:rFonts w:ascii="Verdana" w:hAnsi="Verdana"/>
-          <w:sz w:val="18"/>
-          <w:szCs w:val="18"/>
-        </w:rPr>
-        <w:t>2. A área de entrada de dados para diagnóstico e cálculo de recuperação de solos sódicos é localizada.</w:t>
-      </w:r>
-    </w:p>
-    <w:p>
-      <w:pPr>
-        <w:rPr>
-          <w:rFonts w:ascii="Verdana" w:hAnsi="Verdana"/>
-          <w:sz w:val="18"/>
-          <w:szCs w:val="18"/>
-        </w:rPr>
-      </w:pPr>
-      <w:r>
-        <w:rPr>
-          <w:rFonts w:ascii="Verdana" w:hAnsi="Verdana"/>
-          <w:sz w:val="18"/>
-          <w:szCs w:val="18"/>
-        </w:rPr>
-        <w:t>3. As informações do solo solicitadas são identificadas, assim como o texto de apoio que traz faixa e exemplo em cada campo.</w:t>
+        <w:t>1. Abra a página inicial do RECUPERA-SOLO.</w:t>
+      </w:r>
+    </w:p>
+    <w:p>
+      <w:pPr>
+        <w:rPr>
+          <w:rFonts w:ascii="Verdana" w:hAnsi="Verdana"/>
+          <w:sz w:val="18"/>
+          <w:szCs w:val="18"/>
+        </w:rPr>
+      </w:pPr>
+      <w:r>
+        <w:rPr>
+          <w:rFonts w:ascii="Verdana" w:hAnsi="Verdana"/>
+          <w:sz w:val="18"/>
+          <w:szCs w:val="18"/>
+        </w:rPr>
+        <w:t>2. Localize a área de entrada de dados para diagnóstico e cálculo de recuperação de solos sódicos.</w:t>
+      </w:r>
+    </w:p>
+    <w:p>
+      <w:pPr>
+        <w:rPr>
+          <w:rFonts w:ascii="Verdana" w:hAnsi="Verdana"/>
+          <w:sz w:val="18"/>
+          <w:szCs w:val="18"/>
+        </w:rPr>
+      </w:pPr>
+      <w:r>
+        <w:rPr>
+          <w:rFonts w:ascii="Verdana" w:hAnsi="Verdana"/>
+          <w:sz w:val="18"/>
+          <w:szCs w:val="18"/>
+        </w:rPr>
+        <w:t>3. Identifique quais informações do solo são solicitadas e leia o texto de apoio com faixa e exemplo em cada campo.</w:t>
       </w:r>
     </w:p>
     <w:p>
@@ -697,75 +697,75 @@
           <w:sz w:val="18"/>
           <w:szCs w:val="18"/>
         </w:rPr>
-        <w:t>1. O Caso 1 do Apêndice D é usado no preenchimento dos campos correspondentes. O botão Usar exemplo pode ser acionado antes, para a observação de um caso pronto, e o botão Nova análise limpa os campos.</w:t>
-      </w:r>
-    </w:p>
-    <w:p>
-      <w:pPr>
-        <w:rPr>
-          <w:rFonts w:ascii="Verdana" w:hAnsi="Verdana"/>
-          <w:sz w:val="18"/>
-          <w:szCs w:val="18"/>
-        </w:rPr>
-      </w:pPr>
-      <w:r>
-        <w:rPr>
-          <w:rFonts w:ascii="Verdana" w:hAnsi="Verdana"/>
-          <w:sz w:val="18"/>
-          <w:szCs w:val="18"/>
-        </w:rPr>
-        <w:t>2. As unidades, a profundidade e os demais parâmetros são verificados.</w:t>
-      </w:r>
-    </w:p>
-    <w:p>
-      <w:pPr>
-        <w:rPr>
-          <w:rFonts w:ascii="Verdana" w:hAnsi="Verdana"/>
-          <w:sz w:val="18"/>
-          <w:szCs w:val="18"/>
-        </w:rPr>
-      </w:pPr>
-      <w:r>
-        <w:rPr>
-          <w:rFonts w:ascii="Verdana" w:hAnsi="Verdana"/>
-          <w:sz w:val="18"/>
-          <w:szCs w:val="18"/>
-        </w:rPr>
-        <w:t>3. Os valores do Caso 1 são digitados; o número aparece em negrito dentro da caixa, e a dica permanece sob o campo.</w:t>
-      </w:r>
-    </w:p>
-    <w:p>
-      <w:pPr>
-        <w:rPr>
-          <w:rFonts w:ascii="Verdana" w:hAnsi="Verdana"/>
-          <w:sz w:val="18"/>
-          <w:szCs w:val="18"/>
-        </w:rPr>
-      </w:pPr>
-      <w:r>
-        <w:rPr>
-          <w:rFonts w:ascii="Verdana" w:hAnsi="Verdana"/>
-          <w:sz w:val="18"/>
-          <w:szCs w:val="18"/>
-        </w:rPr>
-        <w:t>4. O botão Gerar diagnóstico e recomendação é acionado. A tecla Enter em qualquer campo produz o mesmo envio.</w:t>
-      </w:r>
-    </w:p>
-    <w:p>
-      <w:pPr>
-        <w:rPr>
-          <w:rFonts w:ascii="Verdana" w:hAnsi="Verdana"/>
-          <w:sz w:val="18"/>
-          <w:szCs w:val="18"/>
-        </w:rPr>
-      </w:pPr>
-      <w:r>
-        <w:rPr>
-          <w:rFonts w:ascii="Verdana" w:hAnsi="Verdana"/>
-          <w:sz w:val="18"/>
-          <w:szCs w:val="18"/>
-        </w:rPr>
-        <w:t>5. A página rola sozinha até a seção Resultados integrados, e o resultado é anunciado pelo leitor de tela.</w:t>
+        <w:t>1. Use o Caso 1 do Apêndice D e preencha os campos correspondentes. Se quiser, clique em Usar exemplo antes, para observar um caso pronto, e em Nova análise para limpar os campos.</w:t>
+      </w:r>
+    </w:p>
+    <w:p>
+      <w:pPr>
+        <w:rPr>
+          <w:rFonts w:ascii="Verdana" w:hAnsi="Verdana"/>
+          <w:sz w:val="18"/>
+          <w:szCs w:val="18"/>
+        </w:rPr>
+      </w:pPr>
+      <w:r>
+        <w:rPr>
+          <w:rFonts w:ascii="Verdana" w:hAnsi="Verdana"/>
+          <w:sz w:val="18"/>
+          <w:szCs w:val="18"/>
+        </w:rPr>
+        <w:t>2. Verifique as unidades, a profundidade e os demais parâmetros.</w:t>
+      </w:r>
+    </w:p>
+    <w:p>
+      <w:pPr>
+        <w:rPr>
+          <w:rFonts w:ascii="Verdana" w:hAnsi="Verdana"/>
+          <w:sz w:val="18"/>
+          <w:szCs w:val="18"/>
+        </w:rPr>
+      </w:pPr>
+      <w:r>
+        <w:rPr>
+          <w:rFonts w:ascii="Verdana" w:hAnsi="Verdana"/>
+          <w:sz w:val="18"/>
+          <w:szCs w:val="18"/>
+        </w:rPr>
+        <w:t>3. Digite os valores do Caso 1; observe o número em negrito dentro da caixa e a dica que permanece sob o campo.</w:t>
+      </w:r>
+    </w:p>
+    <w:p>
+      <w:pPr>
+        <w:rPr>
+          <w:rFonts w:ascii="Verdana" w:hAnsi="Verdana"/>
+          <w:sz w:val="18"/>
+          <w:szCs w:val="18"/>
+        </w:rPr>
+      </w:pPr>
+      <w:r>
+        <w:rPr>
+          <w:rFonts w:ascii="Verdana" w:hAnsi="Verdana"/>
+          <w:sz w:val="18"/>
+          <w:szCs w:val="18"/>
+        </w:rPr>
+        <w:t>4. Clique em Gerar diagnóstico e recomendação. A tecla Enter em qualquer campo produz o mesmo envio.</w:t>
+      </w:r>
+    </w:p>
+    <w:p>
+      <w:pPr>
+        <w:rPr>
+          <w:rFonts w:ascii="Verdana" w:hAnsi="Verdana"/>
+          <w:sz w:val="18"/>
+          <w:szCs w:val="18"/>
+        </w:rPr>
+      </w:pPr>
+      <w:r>
+        <w:rPr>
+          <w:rFonts w:ascii="Verdana" w:hAnsi="Verdana"/>
+          <w:sz w:val="18"/>
+          <w:szCs w:val="18"/>
+        </w:rPr>
+        <w:t>5. Observe a rolagem automática até a seção Resultados integrados e o anúncio do resultado pelo leitor de tela.</w:t>
       </w:r>
     </w:p>
     <w:p>
@@ -978,58 +978,58 @@
           <w:sz w:val="18"/>
           <w:szCs w:val="18"/>
         </w:rPr>
-        <w:t>1. A informação relativa à sodicidade e à necessidade de correção é localizada no cartão Diagnóstico do solo.</w:t>
-      </w:r>
-    </w:p>
-    <w:p>
-      <w:pPr>
-        <w:rPr>
-          <w:rFonts w:ascii="Verdana" w:hAnsi="Verdana"/>
-          <w:sz w:val="18"/>
-          <w:szCs w:val="18"/>
-        </w:rPr>
-      </w:pPr>
-      <w:r>
-        <w:rPr>
-          <w:rFonts w:ascii="Verdana" w:hAnsi="Verdana"/>
-          <w:sz w:val="18"/>
-          <w:szCs w:val="18"/>
-        </w:rPr>
-        <w:t>2. O significado do resultado é explicado em voz alta, com palavras próprias.</w:t>
-      </w:r>
-    </w:p>
-    <w:p>
-      <w:pPr>
-        <w:rPr>
-          <w:rFonts w:ascii="Verdana" w:hAnsi="Verdana"/>
-          <w:sz w:val="18"/>
-          <w:szCs w:val="18"/>
-        </w:rPr>
-      </w:pPr>
-      <w:r>
-        <w:rPr>
-          <w:rFonts w:ascii="Verdana" w:hAnsi="Verdana"/>
-          <w:sz w:val="18"/>
-          <w:szCs w:val="18"/>
-        </w:rPr>
-        <w:t>3. Os alertas, as limitações e as orientações sobre lixiviação e drenagem são identificados, e as questões a seguir são respondidas:</w:t>
-      </w:r>
-    </w:p>
-    <w:p>
-      <w:pPr>
-        <w:rPr>
-          <w:rFonts w:ascii="Verdana" w:hAnsi="Verdana"/>
-          <w:sz w:val="18"/>
-          <w:szCs w:val="18"/>
-        </w:rPr>
-      </w:pPr>
-      <w:r>
-        <w:rPr>
-          <w:rFonts w:ascii="Verdana" w:hAnsi="Verdana"/>
-          <w:sz w:val="18"/>
-          <w:szCs w:val="18"/>
-        </w:rPr>
-        <w:t>4. O cartão Recomendação técnica é lido, e a adequação de cada corretivo é conferida.</w:t>
+        <w:t>1. Localize a informação relativa à sodicidade e à necessidade de correção no cartão Diagnóstico do solo.</w:t>
+      </w:r>
+    </w:p>
+    <w:p>
+      <w:pPr>
+        <w:rPr>
+          <w:rFonts w:ascii="Verdana" w:hAnsi="Verdana"/>
+          <w:sz w:val="18"/>
+          <w:szCs w:val="18"/>
+        </w:rPr>
+      </w:pPr>
+      <w:r>
+        <w:rPr>
+          <w:rFonts w:ascii="Verdana" w:hAnsi="Verdana"/>
+          <w:sz w:val="18"/>
+          <w:szCs w:val="18"/>
+        </w:rPr>
+        <w:t>2. Explique em voz alta, com suas palavras, o que o resultado significa.</w:t>
+      </w:r>
+    </w:p>
+    <w:p>
+      <w:pPr>
+        <w:rPr>
+          <w:rFonts w:ascii="Verdana" w:hAnsi="Verdana"/>
+          <w:sz w:val="18"/>
+          <w:szCs w:val="18"/>
+        </w:rPr>
+      </w:pPr>
+      <w:r>
+        <w:rPr>
+          <w:rFonts w:ascii="Verdana" w:hAnsi="Verdana"/>
+          <w:sz w:val="18"/>
+          <w:szCs w:val="18"/>
+        </w:rPr>
+        <w:t>3. Identifique os alertas, as limitações e as orientações sobre lixiviação e drenagem e responda às questões a seguir:</w:t>
+      </w:r>
+    </w:p>
+    <w:p>
+      <w:pPr>
+        <w:rPr>
+          <w:rFonts w:ascii="Verdana" w:hAnsi="Verdana"/>
+          <w:sz w:val="18"/>
+          <w:szCs w:val="18"/>
+        </w:rPr>
+      </w:pPr>
+      <w:r>
+        <w:rPr>
+          <w:rFonts w:ascii="Verdana" w:hAnsi="Verdana"/>
+          <w:sz w:val="18"/>
+          <w:szCs w:val="18"/>
+        </w:rPr>
+        <w:t>4. Leia o cartão Recomendação técnica e confira a adequação de cada corretivo.</w:t>
       </w:r>
     </w:p>
     <w:p>
@@ -1255,58 +1255,58 @@
           <w:sz w:val="18"/>
           <w:szCs w:val="18"/>
         </w:rPr>
-        <w:t>1. Na seção Corretivos e custos, o gesso agrícola e outro corretivo disponível são marcados na caixa de seleção de cada cartão.</w:t>
-      </w:r>
-    </w:p>
-    <w:p>
-      <w:pPr>
-        <w:rPr>
-          <w:rFonts w:ascii="Verdana" w:hAnsi="Verdana"/>
-          <w:sz w:val="18"/>
-          <w:szCs w:val="18"/>
-        </w:rPr>
-      </w:pPr>
-      <w:r>
-        <w:rPr>
-          <w:rFonts w:ascii="Verdana" w:hAnsi="Verdana"/>
-          <w:sz w:val="18"/>
-          <w:szCs w:val="18"/>
-        </w:rPr>
-        <w:t>2. A pureza de cada corretivo marcado é informada.</w:t>
-      </w:r>
-    </w:p>
-    <w:p>
-      <w:pPr>
-        <w:rPr>
-          <w:rFonts w:ascii="Verdana" w:hAnsi="Verdana"/>
-          <w:sz w:val="18"/>
-          <w:szCs w:val="18"/>
-        </w:rPr>
-      </w:pPr>
-      <w:r>
-        <w:rPr>
-          <w:rFonts w:ascii="Verdana" w:hAnsi="Verdana"/>
-          <w:sz w:val="18"/>
-          <w:szCs w:val="18"/>
-        </w:rPr>
-        <w:t>3. O diagnóstico é gerado e, em Resultados integrados, a justificativa apresentada para cada corretivo é localizada.</w:t>
-      </w:r>
-    </w:p>
-    <w:p>
-      <w:pPr>
-        <w:rPr>
-          <w:rFonts w:ascii="Verdana" w:hAnsi="Verdana"/>
-          <w:sz w:val="18"/>
-          <w:szCs w:val="18"/>
-        </w:rPr>
-      </w:pPr>
-      <w:r>
-        <w:rPr>
-          <w:rFonts w:ascii="Verdana" w:hAnsi="Verdana"/>
-          <w:sz w:val="18"/>
-          <w:szCs w:val="18"/>
-        </w:rPr>
-        <w:t>4. As justificativas e a adequação dos dois corretivos são comparadas.</w:t>
+        <w:t>1. Na seção Corretivos e custos, marque o gesso agrícola e outro corretivo disponível na caixa de seleção de cada cartão.</w:t>
+      </w:r>
+    </w:p>
+    <w:p>
+      <w:pPr>
+        <w:rPr>
+          <w:rFonts w:ascii="Verdana" w:hAnsi="Verdana"/>
+          <w:sz w:val="18"/>
+          <w:szCs w:val="18"/>
+        </w:rPr>
+      </w:pPr>
+      <w:r>
+        <w:rPr>
+          <w:rFonts w:ascii="Verdana" w:hAnsi="Verdana"/>
+          <w:sz w:val="18"/>
+          <w:szCs w:val="18"/>
+        </w:rPr>
+        <w:t>2. Informe a pureza de cada corretivo marcado.</w:t>
+      </w:r>
+    </w:p>
+    <w:p>
+      <w:pPr>
+        <w:rPr>
+          <w:rFonts w:ascii="Verdana" w:hAnsi="Verdana"/>
+          <w:sz w:val="18"/>
+          <w:szCs w:val="18"/>
+        </w:rPr>
+      </w:pPr>
+      <w:r>
+        <w:rPr>
+          <w:rFonts w:ascii="Verdana" w:hAnsi="Verdana"/>
+          <w:sz w:val="18"/>
+          <w:szCs w:val="18"/>
+        </w:rPr>
+        <w:t>3. Gere o diagnóstico e, em Resultados integrados, localize a justificativa apresentada para cada corretivo.</w:t>
+      </w:r>
+    </w:p>
+    <w:p>
+      <w:pPr>
+        <w:rPr>
+          <w:rFonts w:ascii="Verdana" w:hAnsi="Verdana"/>
+          <w:sz w:val="18"/>
+          <w:szCs w:val="18"/>
+        </w:rPr>
+      </w:pPr>
+      <w:r>
+        <w:rPr>
+          <w:rFonts w:ascii="Verdana" w:hAnsi="Verdana"/>
+          <w:sz w:val="18"/>
+          <w:szCs w:val="18"/>
+        </w:rPr>
+        <w:t>4. Compare as justificativas e a adequação dos dois corretivos.</w:t>
       </w:r>
     </w:p>
     <w:p>
@@ -1525,58 +1525,58 @@
           <w:sz w:val="18"/>
           <w:szCs w:val="18"/>
         </w:rPr>
-        <w:t>1. Para o Caso 1, a dose teórica, a dose prática e a dose comercial são localizadas na tabela Dose e custo.</w:t>
-      </w:r>
-    </w:p>
-    <w:p>
-      <w:pPr>
-        <w:rPr>
-          <w:rFonts w:ascii="Verdana" w:hAnsi="Verdana"/>
-          <w:sz w:val="18"/>
-          <w:szCs w:val="18"/>
-        </w:rPr>
-      </w:pPr>
-      <w:r>
-        <w:rPr>
-          <w:rFonts w:ascii="Verdana" w:hAnsi="Verdana"/>
-          <w:sz w:val="18"/>
-          <w:szCs w:val="18"/>
-        </w:rPr>
-        <w:t>2. A unidade de cada resultado é informada, e a possibilidade de ajustar a pureza e o preço é verificada.</w:t>
-      </w:r>
-    </w:p>
-    <w:p>
-      <w:pPr>
-        <w:rPr>
-          <w:rFonts w:ascii="Verdana" w:hAnsi="Verdana"/>
-          <w:sz w:val="18"/>
-          <w:szCs w:val="18"/>
-        </w:rPr>
-      </w:pPr>
-      <w:r>
-        <w:rPr>
-          <w:rFonts w:ascii="Verdana" w:hAnsi="Verdana"/>
-          <w:sz w:val="18"/>
-          <w:szCs w:val="18"/>
-        </w:rPr>
-        <w:t>3. A pureza (85%) e o preço (R$ 400/t) do gesso agrícola são informados.</w:t>
-      </w:r>
-    </w:p>
-    <w:p>
-      <w:pPr>
-        <w:rPr>
-          <w:rFonts w:ascii="Verdana" w:hAnsi="Verdana"/>
-          <w:sz w:val="18"/>
-          <w:szCs w:val="18"/>
-        </w:rPr>
-      </w:pPr>
-      <w:r>
-        <w:rPr>
-          <w:rFonts w:ascii="Verdana" w:hAnsi="Verdana"/>
-          <w:sz w:val="18"/>
-          <w:szCs w:val="18"/>
-        </w:rPr>
-        <w:t>4. O botão Compartilhar resumo é acionado, o texto do resumo é conferido e a origem do compartilhamento é registrada (aplicativo, Web Share ou cópia).</w:t>
+        <w:t>1. Para o Caso 1, localize a dose teórica, a dose prática e a dose comercial na tabela Dose e custo.</w:t>
+      </w:r>
+    </w:p>
+    <w:p>
+      <w:pPr>
+        <w:rPr>
+          <w:rFonts w:ascii="Verdana" w:hAnsi="Verdana"/>
+          <w:sz w:val="18"/>
+          <w:szCs w:val="18"/>
+        </w:rPr>
+      </w:pPr>
+      <w:r>
+        <w:rPr>
+          <w:rFonts w:ascii="Verdana" w:hAnsi="Verdana"/>
+          <w:sz w:val="18"/>
+          <w:szCs w:val="18"/>
+        </w:rPr>
+        <w:t>2. Informe a unidade de cada resultado e verifique se a pureza e o preço podem ser ajustados.</w:t>
+      </w:r>
+    </w:p>
+    <w:p>
+      <w:pPr>
+        <w:rPr>
+          <w:rFonts w:ascii="Verdana" w:hAnsi="Verdana"/>
+          <w:sz w:val="18"/>
+          <w:szCs w:val="18"/>
+        </w:rPr>
+      </w:pPr>
+      <w:r>
+        <w:rPr>
+          <w:rFonts w:ascii="Verdana" w:hAnsi="Verdana"/>
+          <w:sz w:val="18"/>
+          <w:szCs w:val="18"/>
+        </w:rPr>
+        <w:t>3. Informe a pureza (85%) e o preço (R$ 400/t) do gesso agrícola.</w:t>
+      </w:r>
+    </w:p>
+    <w:p>
+      <w:pPr>
+        <w:rPr>
+          <w:rFonts w:ascii="Verdana" w:hAnsi="Verdana"/>
+          <w:sz w:val="18"/>
+          <w:szCs w:val="18"/>
+        </w:rPr>
+      </w:pPr>
+      <w:r>
+        <w:rPr>
+          <w:rFonts w:ascii="Verdana" w:hAnsi="Verdana"/>
+          <w:sz w:val="18"/>
+          <w:szCs w:val="18"/>
+        </w:rPr>
+        <w:t>4. Clique em Compartilhar resumo, confira o texto do resumo e registre a origem do compartilhamento (aplicativo, Web Share ou cópia).</w:t>
       </w:r>
     </w:p>
     <w:p>
@@ -1805,58 +1805,58 @@
           <w:sz w:val="18"/>
           <w:szCs w:val="18"/>
         </w:rPr>
-        <w:t>1. O Caso 2 do Apêndice D é usado em uma nova simulação. Antes, o botão Nova análise é acionado, e o diálogo Limpar os dados? é observado: o Cancelar mantém o preenchimento, e o Limpar apaga campos e resultados.</w:t>
-      </w:r>
-    </w:p>
-    <w:p>
-      <w:pPr>
-        <w:rPr>
-          <w:rFonts w:ascii="Verdana" w:hAnsi="Verdana"/>
-          <w:sz w:val="18"/>
-          <w:szCs w:val="18"/>
-        </w:rPr>
-      </w:pPr>
-      <w:r>
-        <w:rPr>
-          <w:rFonts w:ascii="Verdana" w:hAnsi="Verdana"/>
-          <w:sz w:val="18"/>
-          <w:szCs w:val="18"/>
-        </w:rPr>
-        <w:t>2. Os resultados são comparados com os do Caso 1, e as diferenças percebidas são explicadas.</w:t>
-      </w:r>
-    </w:p>
-    <w:p>
-      <w:pPr>
-        <w:rPr>
-          <w:rFonts w:ascii="Verdana" w:hAnsi="Verdana"/>
-          <w:sz w:val="18"/>
-          <w:szCs w:val="18"/>
-        </w:rPr>
-      </w:pPr>
-      <w:r>
-        <w:rPr>
-          <w:rFonts w:ascii="Verdana" w:hAnsi="Verdana"/>
-          <w:sz w:val="18"/>
-          <w:szCs w:val="18"/>
-        </w:rPr>
-        <w:t>3. A pureza (70%) e o preço (R$ 520/t) do gesso agrícola são informados.</w:t>
-      </w:r>
-    </w:p>
-    <w:p>
-      <w:pPr>
-        <w:rPr>
-          <w:rFonts w:ascii="Verdana" w:hAnsi="Verdana"/>
-          <w:sz w:val="18"/>
-          <w:szCs w:val="18"/>
-        </w:rPr>
-      </w:pPr>
-      <w:r>
-        <w:rPr>
-          <w:rFonts w:ascii="Verdana" w:hAnsi="Verdana"/>
-          <w:sz w:val="18"/>
-          <w:szCs w:val="18"/>
-        </w:rPr>
-        <w:t>4. O botão Voltar ao início é acionado ao final da leitura, e o retorno ao formulário é observado.</w:t>
+        <w:t>1. Use o Caso 2 do Apêndice D em uma nova simulação. Antes, clique em Nova análise e observe o diálogo Limpar os dados?: o Cancelar mantém o preenchimento, e o Limpar apaga campos e resultados.</w:t>
+      </w:r>
+    </w:p>
+    <w:p>
+      <w:pPr>
+        <w:rPr>
+          <w:rFonts w:ascii="Verdana" w:hAnsi="Verdana"/>
+          <w:sz w:val="18"/>
+          <w:szCs w:val="18"/>
+        </w:rPr>
+      </w:pPr>
+      <w:r>
+        <w:rPr>
+          <w:rFonts w:ascii="Verdana" w:hAnsi="Verdana"/>
+          <w:sz w:val="18"/>
+          <w:szCs w:val="18"/>
+        </w:rPr>
+        <w:t>2. Compare os resultados com os do Caso 1 e explique as diferenças percebidas.</w:t>
+      </w:r>
+    </w:p>
+    <w:p>
+      <w:pPr>
+        <w:rPr>
+          <w:rFonts w:ascii="Verdana" w:hAnsi="Verdana"/>
+          <w:sz w:val="18"/>
+          <w:szCs w:val="18"/>
+        </w:rPr>
+      </w:pPr>
+      <w:r>
+        <w:rPr>
+          <w:rFonts w:ascii="Verdana" w:hAnsi="Verdana"/>
+          <w:sz w:val="18"/>
+          <w:szCs w:val="18"/>
+        </w:rPr>
+        <w:t>3. Informe a pureza (70%) e o preço (R$ 520/t) do gesso agrícola.</w:t>
+      </w:r>
+    </w:p>
+    <w:p>
+      <w:pPr>
+        <w:rPr>
+          <w:rFonts w:ascii="Verdana" w:hAnsi="Verdana"/>
+          <w:sz w:val="18"/>
+          <w:szCs w:val="18"/>
+        </w:rPr>
+      </w:pPr>
+      <w:r>
+        <w:rPr>
+          <w:rFonts w:ascii="Verdana" w:hAnsi="Verdana"/>
+          <w:sz w:val="18"/>
+          <w:szCs w:val="18"/>
+        </w:rPr>
+        <w:t>4. Ao final da leitura, clique em Voltar ao início e observe o retorno ao formulário.</w:t>
       </w:r>
     </w:p>
     <w:p>
@@ -2033,22 +2033,22 @@
     </w:p>
     <w:p>
       <w:r>
-        <w:t>1. O APK é instalado no aparelho e o aplicativo é aberto; a barra de status e a tela de abertura aparecem na cor do site.</w:t>
-      </w:r>
-    </w:p>
-    <w:p>
-      <w:r>
-        <w:t>2. O modo avião é ativado.</w:t>
-      </w:r>
-    </w:p>
-    <w:p>
-      <w:r>
-        <w:t>3. O Caso 1 é repetido e o diagnóstico é gerado.</w:t>
-      </w:r>
-    </w:p>
-    <w:p>
-      <w:r>
-        <w:t>4. O resultado é comparado com o obtido no navegador.</w:t>
+        <w:t>1. Instale o APK no aparelho e abra o aplicativo; observe a barra de status e a tela de abertura na cor do site.</w:t>
+      </w:r>
+    </w:p>
+    <w:p>
+      <w:r>
+        <w:t>2. Ative o modo avião.</w:t>
+      </w:r>
+    </w:p>
+    <w:p>
+      <w:r>
+        <w:t>3. Repita o Caso 1 e gere o diagnóstico.</w:t>
+      </w:r>
+    </w:p>
+    <w:p>
+      <w:r>
+        <w:t>4. Compare o resultado com o obtido no navegador.</w:t>
       </w:r>
     </w:p>
     <w:p>
@@ -2067,22 +2067,22 @@
     </w:p>
     <w:p>
       <w:r>
-        <w:t>1. No campo pH, uma letra é digitada.</w:t>
-      </w:r>
-    </w:p>
-    <w:p>
-      <w:r>
-        <w:t>2. A permanência do caractere no campo é verificada.</w:t>
-      </w:r>
-    </w:p>
-    <w:p>
-      <w:r>
-        <w:t>3. O pH 15 é informado; o aviso surge durante a digitação e o valor é recusado no envio.</w:t>
-      </w:r>
-    </w:p>
-    <w:p>
-      <w:r>
-        <w:t>4. A mensagem apresentada é lida, o resumo de erros no topo é localizado e o valor é corrigido; o aviso desaparece.</w:t>
+        <w:t>1. No campo pH, digite uma letra.</w:t>
+      </w:r>
+    </w:p>
+    <w:p>
+      <w:r>
+        <w:t>2. Verifique se o caractere entrou no campo.</w:t>
+      </w:r>
+    </w:p>
+    <w:p>
+      <w:r>
+        <w:t>3. Informe o pH 15; observe o aviso durante a digitação e a recusa no envio.</w:t>
+      </w:r>
+    </w:p>
+    <w:p>
+      <w:r>
+        <w:t>4. Leia a mensagem, localize o resumo de erros no topo e corrija o valor; observe o desaparecimento do aviso.</w:t>
       </w:r>
     </w:p>
     <w:p>
@@ -2112,24 +2112,24 @@
           <w:sz w:val="18"/>
           <w:szCs w:val="18"/>
         </w:rPr>
-        <w:t>1. A seção Como o cálculo funciona é aberta, no fim do formulário.</w:t>
-      </w:r>
-    </w:p>
-    <w:p>
-      <w:pPr>
-        <w:rPr>
-          <w:rFonts w:ascii="Verdana" w:hAnsi="Verdana"/>
-          <w:sz w:val="18"/>
-          <w:szCs w:val="18"/>
-        </w:rPr>
-      </w:pPr>
-      <w:r>
-        <w:rPr>
-          <w:rFonts w:ascii="Verdana" w:hAnsi="Verdana"/>
-          <w:sz w:val="18"/>
-          <w:szCs w:val="18"/>
-        </w:rPr>
-        <w:t>2. As fórmulas e os coeficientes apresentados são localizados.</w:t>
+        <w:t>1. Abra a seção Como o cálculo funciona, no fim do formulário.</w:t>
+      </w:r>
+    </w:p>
+    <w:p>
+      <w:pPr>
+        <w:rPr>
+          <w:rFonts w:ascii="Verdana" w:hAnsi="Verdana"/>
+          <w:sz w:val="18"/>
+          <w:szCs w:val="18"/>
+        </w:rPr>
+      </w:pPr>
+      <w:r>
+        <w:rPr>
+          <w:rFonts w:ascii="Verdana" w:hAnsi="Verdana"/>
+          <w:sz w:val="18"/>
+          <w:szCs w:val="18"/>
+        </w:rPr>
+        <w:t>2. Localize as fórmulas e os coeficientes apresentados.</w:t>
       </w:r>
     </w:p>
     <w:p>

</xml_diff>